<commit_message>
Rewrite section 9 in plain language and use MySQL wording
Co-Authored-By: Claude Sonnet 5.5 <noreply@anthropic.com>
</commit_message>
<xml_diff>
--- a/Testing_Results_Table.docx
+++ b/Testing_Results_Table.docx
@@ -330,7 +330,7 @@
                 <w:sz w:val="16"/>
                 <w:szCs w:val="16"/>
               </w:rPr>
-              <w:t xml:space="preserve">Verify valid administrator login.</w:t>
+              <w:t xml:space="preserve">Check that the administrator can log in.</w:t>
             </w:r>
           </w:p>
         </w:tc>
@@ -359,22 +359,7 @@
                 <w:sz w:val="16"/>
                 <w:szCs w:val="16"/>
               </w:rPr>
-              <w:t xml:space="preserve">Pre: fresh </w:t>
-            </w:r>
-            <w:r>
-              <w:rPr>
-                <w:rFonts w:ascii="Consolas" w:cs="Consolas" w:eastAsia="Consolas" w:hAnsi="Consolas"/>
-                <w:sz w:val="15"/>
-                <w:szCs w:val="15"/>
-              </w:rPr>
-              <w:t xml:space="preserve">inventory_db.sql</w:t>
-            </w:r>
-            <w:r>
-              <w:rPr>
-                <w:sz w:val="16"/>
-                <w:szCs w:val="16"/>
-              </w:rPr>
-              <w:t xml:space="preserve"> import.</w:t>
+              <w:t xml:space="preserve">Pre: fresh database import.</w:t>
             </w:r>
           </w:p>
           <w:p>
@@ -483,7 +468,7 @@
                 <w:sz w:val="16"/>
                 <w:szCs w:val="16"/>
               </w:rPr>
-              <w:t xml:space="preserve">4. Check the dashboard and the navbar.</w:t>
+              <w:t xml:space="preserve">4. Look at the dashboard and the navbar.</w:t>
             </w:r>
           </w:p>
         </w:tc>
@@ -512,7 +497,7 @@
                 <w:sz w:val="16"/>
                 <w:szCs w:val="16"/>
               </w:rPr>
-              <w:t xml:space="preserve">Functional; positive authentication.</w:t>
+              <w:t xml:space="preserve">Functional, valid login</w:t>
             </w:r>
           </w:p>
         </w:tc>
@@ -593,7 +578,7 @@
                 <w:sz w:val="16"/>
                 <w:szCs w:val="16"/>
               </w:rPr>
-              <w:t xml:space="preserve">Dashboard opens and Users link is visible.</w:t>
+              <w:t xml:space="preserve">The dashboard opens and the navbar shows the Users link.</w:t>
             </w:r>
           </w:p>
         </w:tc>
@@ -622,37 +607,7 @@
                 <w:sz w:val="16"/>
                 <w:szCs w:val="16"/>
               </w:rPr>
-              <w:t xml:space="preserve">Login with </w:t>
-            </w:r>
-            <w:r>
-              <w:rPr>
-                <w:rFonts w:ascii="Consolas" w:cs="Consolas" w:eastAsia="Consolas" w:hAnsi="Consolas"/>
-                <w:sz w:val="15"/>
-                <w:szCs w:val="15"/>
-              </w:rPr>
-              <w:t xml:space="preserve">admin</w:t>
-            </w:r>
-            <w:r>
-              <w:rPr>
-                <w:sz w:val="16"/>
-                <w:szCs w:val="16"/>
-              </w:rPr>
-              <w:t xml:space="preserve"> / </w:t>
-            </w:r>
-            <w:r>
-              <w:rPr>
-                <w:rFonts w:ascii="Consolas" w:cs="Consolas" w:eastAsia="Consolas" w:hAnsi="Consolas"/>
-                <w:sz w:val="15"/>
-                <w:szCs w:val="15"/>
-              </w:rPr>
-              <w:t xml:space="preserve">password</w:t>
-            </w:r>
-            <w:r>
-              <w:rPr>
-                <w:sz w:val="16"/>
-                <w:szCs w:val="16"/>
-              </w:rPr>
-              <w:t xml:space="preserve"> redirected to </w:t>
+              <w:t xml:space="preserve">The browser went to </w:t>
             </w:r>
             <w:r>
               <w:rPr>
@@ -667,7 +622,7 @@
                 <w:sz w:val="16"/>
                 <w:szCs w:val="16"/>
               </w:rPr>
-              <w:t xml:space="preserve">. Dashboard heading, summary cards (8 products, 0 units sold today, 2 low-stock items, $19,479.19 value) and the administrator-only </w:t>
+              <w:t xml:space="preserve">. The dashboard showed the summary cards (8 products, 0 units sold today, 2 low-stock items, $19,479.19 inventory value) and the </w:t>
             </w:r>
             <w:r>
               <w:rPr>
@@ -683,7 +638,7 @@
                 <w:sz w:val="16"/>
                 <w:szCs w:val="16"/>
               </w:rPr>
-              <w:t xml:space="preserve"> link were visible; navbar showed “Administrator”. </w:t>
+              <w:t xml:space="preserve"> link. The navbar showed “Administrator”. </w:t>
             </w:r>
             <w:r>
               <w:rPr>
@@ -815,7 +770,7 @@
                 <w:sz w:val="16"/>
                 <w:szCs w:val="16"/>
               </w:rPr>
-              <w:t xml:space="preserve">Verify invalid credentials are rejected.</w:t>
+              <w:t xml:space="preserve">Check that a wrong password is rejected.</w:t>
             </w:r>
           </w:p>
         </w:tc>
@@ -886,7 +841,7 @@
                 <w:sz w:val="16"/>
                 <w:szCs w:val="16"/>
               </w:rPr>
-              <w:t xml:space="preserve"> and wrong password </w:t>
+              <w:t xml:space="preserve"> and password </w:t>
             </w:r>
             <w:r>
               <w:rPr>
@@ -941,7 +896,7 @@
                 <w:sz w:val="16"/>
                 <w:szCs w:val="16"/>
               </w:rPr>
-              <w:t xml:space="preserve">4. Check the page and the alert.</w:t>
+              <w:t xml:space="preserve">4. Read the page and the alert.</w:t>
             </w:r>
           </w:p>
         </w:tc>
@@ -970,7 +925,7 @@
                 <w:sz w:val="16"/>
                 <w:szCs w:val="16"/>
               </w:rPr>
-              <w:t xml:space="preserve">Invalid-input/security.</w:t>
+              <w:t xml:space="preserve">Security, invalid input</w:t>
             </w:r>
           </w:p>
         </w:tc>
@@ -1014,7 +969,7 @@
                 <w:sz w:val="16"/>
                 <w:szCs w:val="16"/>
               </w:rPr>
-              <w:t xml:space="preserve"> (existing); password </w:t>
+              <w:t xml:space="preserve"> (exists); password </w:t>
             </w:r>
             <w:r>
               <w:rPr>
@@ -1029,7 +984,7 @@
                 <w:sz w:val="16"/>
                 <w:szCs w:val="16"/>
               </w:rPr>
-              <w:t xml:space="preserve"> (invalid)</w:t>
+              <w:t xml:space="preserve"> (wrong)</w:t>
             </w:r>
           </w:p>
         </w:tc>
@@ -1058,7 +1013,7 @@
                 <w:sz w:val="16"/>
                 <w:szCs w:val="16"/>
               </w:rPr>
-              <w:t xml:space="preserve">Login page remains and “Invalid username or password.” appears.</w:t>
+              <w:t xml:space="preserve">The login page stays open and shows “Invalid username or password.”</w:t>
             </w:r>
           </w:p>
         </w:tc>
@@ -1087,7 +1042,22 @@
                 <w:sz w:val="16"/>
                 <w:szCs w:val="16"/>
               </w:rPr>
-              <w:t xml:space="preserve">Submitting </w:t>
+              <w:t xml:space="preserve">The browser stayed on </w:t>
+            </w:r>
+            <w:r>
+              <w:rPr>
+                <w:rFonts w:ascii="Consolas" w:cs="Consolas" w:eastAsia="Consolas" w:hAnsi="Consolas"/>
+                <w:sz w:val="15"/>
+                <w:szCs w:val="15"/>
+              </w:rPr>
+              <w:t xml:space="preserve">login.php</w:t>
+            </w:r>
+            <w:r>
+              <w:rPr>
+                <w:sz w:val="16"/>
+                <w:szCs w:val="16"/>
+              </w:rPr>
+              <w:t xml:space="preserve"> and showed a red alert, “Invalid username or password.” The username field kept </w:t>
             </w:r>
             <w:r>
               <w:rPr>
@@ -1102,52 +1072,7 @@
                 <w:sz w:val="16"/>
                 <w:szCs w:val="16"/>
               </w:rPr>
-              <w:t xml:space="preserve"> / </w:t>
-            </w:r>
-            <w:r>
-              <w:rPr>
-                <w:rFonts w:ascii="Consolas" w:cs="Consolas" w:eastAsia="Consolas" w:hAnsi="Consolas"/>
-                <w:sz w:val="15"/>
-                <w:szCs w:val="15"/>
-              </w:rPr>
-              <w:t xml:space="preserve">wrong-password-123</w:t>
-            </w:r>
-            <w:r>
-              <w:rPr>
-                <w:sz w:val="16"/>
-                <w:szCs w:val="16"/>
-              </w:rPr>
-              <w:t xml:space="preserve"> kept the browser on </w:t>
-            </w:r>
-            <w:r>
-              <w:rPr>
-                <w:rFonts w:ascii="Consolas" w:cs="Consolas" w:eastAsia="Consolas" w:hAnsi="Consolas"/>
-                <w:sz w:val="15"/>
-                <w:szCs w:val="15"/>
-              </w:rPr>
-              <w:t xml:space="preserve">login.php</w:t>
-            </w:r>
-            <w:r>
-              <w:rPr>
-                <w:sz w:val="16"/>
-                <w:szCs w:val="16"/>
-              </w:rPr>
-              <w:t xml:space="preserve">; red alert “Invalid username or password.” was shown, username field retained </w:t>
-            </w:r>
-            <w:r>
-              <w:rPr>
-                <w:rFonts w:ascii="Consolas" w:cs="Consolas" w:eastAsia="Consolas" w:hAnsi="Consolas"/>
-                <w:sz w:val="15"/>
-                <w:szCs w:val="15"/>
-              </w:rPr>
-              <w:t xml:space="preserve">admin</w:t>
-            </w:r>
-            <w:r>
-              <w:rPr>
-                <w:sz w:val="16"/>
-                <w:szCs w:val="16"/>
-              </w:rPr>
-              <w:t xml:space="preserve">, password cleared, no dashboard. </w:t>
+              <w:t xml:space="preserve">, the password field was empty, and no dashboard opened. </w:t>
             </w:r>
             <w:r>
               <w:rPr>
@@ -1279,7 +1204,7 @@
                 <w:sz w:val="16"/>
                 <w:szCs w:val="16"/>
               </w:rPr>
-              <w:t xml:space="preserve">Verify registration boundary validation.</w:t>
+              <w:t xml:space="preserve">Check the minimum username length on the registration form.</w:t>
             </w:r>
           </w:p>
         </w:tc>
@@ -1365,7 +1290,7 @@
                 <w:sz w:val="16"/>
                 <w:szCs w:val="16"/>
               </w:rPr>
-              <w:t xml:space="preserve"> (2 characters, below the 3-character minimum), password </w:t>
+              <w:t xml:space="preserve"> (2 characters, one below the minimum of 3), password </w:t>
             </w:r>
             <w:r>
               <w:rPr>
@@ -1380,7 +1305,7 @@
                 <w:sz w:val="16"/>
                 <w:szCs w:val="16"/>
               </w:rPr>
-              <w:t xml:space="preserve">, confirm password </w:t>
+              <w:t xml:space="preserve"> and confirm password </w:t>
             </w:r>
             <w:r>
               <w:rPr>
@@ -1395,7 +1320,7 @@
                 <w:sz w:val="16"/>
                 <w:szCs w:val="16"/>
               </w:rPr>
-              <w:t xml:space="preserve"> (mismatch).</w:t>
+              <w:t xml:space="preserve"> (does not match).</w:t>
             </w:r>
           </w:p>
           <w:p>
@@ -1452,7 +1377,7 @@
                 <w:sz w:val="16"/>
                 <w:szCs w:val="16"/>
               </w:rPr>
-              <w:t xml:space="preserve">Boundary; invalid input.</w:t>
+              <w:t xml:space="preserve">Boundary, invalid input</w:t>
             </w:r>
           </w:p>
         </w:tc>
@@ -1563,7 +1488,7 @@
                 <w:sz w:val="16"/>
                 <w:szCs w:val="16"/>
               </w:rPr>
-              <w:t xml:space="preserve">Registration is rejected; page stays on </w:t>
+              <w:t xml:space="preserve">The form rejects the registration, stays on </w:t>
             </w:r>
             <w:r>
               <w:rPr>
@@ -1578,7 +1503,7 @@
                 <w:sz w:val="16"/>
                 <w:szCs w:val="16"/>
               </w:rPr>
-              <w:t xml:space="preserve"> with “Username must be at least 3 characters.”</w:t>
+              <w:t xml:space="preserve"> and shows “Username must be at least 3 characters.”</w:t>
             </w:r>
           </w:p>
         </w:tc>
@@ -1607,22 +1532,7 @@
                 <w:sz w:val="16"/>
                 <w:szCs w:val="16"/>
               </w:rPr>
-              <w:t xml:space="preserve">Submitting </w:t>
-            </w:r>
-            <w:r>
-              <w:rPr>
-                <w:rFonts w:ascii="Consolas" w:cs="Consolas" w:eastAsia="Consolas" w:hAnsi="Consolas"/>
-                <w:sz w:val="15"/>
-                <w:szCs w:val="15"/>
-              </w:rPr>
-              <w:t xml:space="preserve">ab</w:t>
-            </w:r>
-            <w:r>
-              <w:rPr>
-                <w:sz w:val="16"/>
-                <w:szCs w:val="16"/>
-              </w:rPr>
-              <w:t xml:space="preserve"> with mismatched passwords stayed on </w:t>
+              <w:t xml:space="preserve">The page stayed on </w:t>
             </w:r>
             <w:r>
               <w:rPr>
@@ -1637,7 +1547,7 @@
                 <w:sz w:val="16"/>
                 <w:szCs w:val="16"/>
               </w:rPr>
-              <w:t xml:space="preserve"> with alert “Username must be at least 3 characters.” (username check fires before the mismatch check); no account created. </w:t>
+              <w:t xml:space="preserve"> and showed “Username must be at least 3 characters.” The app checks the username before the password match, so it did not report the mismatch. No account was created. </w:t>
             </w:r>
             <w:r>
               <w:rPr>
@@ -1769,7 +1679,7 @@
                 <w:sz w:val="16"/>
                 <w:szCs w:val="16"/>
               </w:rPr>
-              <w:t xml:space="preserve">Verify admin product creation.</w:t>
+              <w:t xml:space="preserve">Check that an administrator can add a product.</w:t>
             </w:r>
           </w:p>
         </w:tc>
@@ -1853,7 +1763,7 @@
                 <w:sz w:val="16"/>
                 <w:szCs w:val="16"/>
               </w:rPr>
-              <w:t xml:space="preserve">2. Fill the Add Product form with the test data.</w:t>
+              <w:t xml:space="preserve">2. Fill in the Add Product form with the test data.</w:t>
             </w:r>
           </w:p>
           <w:p>
@@ -1893,7 +1803,7 @@
                 <w:sz w:val="16"/>
                 <w:szCs w:val="16"/>
               </w:rPr>
-              <w:t xml:space="preserve">4. Check the alert and the product table.</w:t>
+              <w:t xml:space="preserve">4. Read the alert and find the new row in the product table.</w:t>
             </w:r>
           </w:p>
         </w:tc>
@@ -1922,7 +1832,7 @@
                 <w:sz w:val="16"/>
                 <w:szCs w:val="16"/>
               </w:rPr>
-              <w:t xml:space="preserve">Functional CRUD; normal input.</w:t>
+              <w:t xml:space="preserve">Functional, valid input</w:t>
             </w:r>
           </w:p>
         </w:tc>
@@ -2033,7 +1943,7 @@
                 <w:sz w:val="16"/>
                 <w:szCs w:val="16"/>
               </w:rPr>
-              <w:t xml:space="preserve">Alert “Product 'Test Wireless Charger' added successfully!” and a table row with Accessories, $29.99, stock 10.</w:t>
+              <w:t xml:space="preserve">The alert “Product 'Test Wireless Charger' added successfully!” appears, and the table shows a row with Accessories, $29.99 and stock 10.</w:t>
             </w:r>
           </w:p>
         </w:tc>
@@ -2062,7 +1972,7 @@
                 <w:sz w:val="16"/>
                 <w:szCs w:val="16"/>
               </w:rPr>
-              <w:t xml:space="preserve">Success alert “Product 'Test Wireless Charger' added successfully!” appeared. The Products table (now 9 total) lists ID 9, Test Wireless Charger, Accessories, $29.99, stock 10, in A–Z order. </w:t>
+              <w:t xml:space="preserve">The alert “Product 'Test Wireless Charger' added successfully!” appeared. The table now holds 9 products and lists ID 9, Test Wireless Charger, Accessories, $29.99, stock 10, in alphabetical order. </w:t>
             </w:r>
             <w:r>
               <w:rPr>
@@ -2194,7 +2104,7 @@
                 <w:sz w:val="16"/>
                 <w:szCs w:val="16"/>
               </w:rPr>
-              <w:t xml:space="preserve">Verify valid and boundary Product ID search.</w:t>
+              <w:t xml:space="preserve">Check the Product ID search with a valid ID and a boundary ID.</w:t>
             </w:r>
           </w:p>
         </w:tc>
@@ -2266,7 +2176,7 @@
                 <w:sz w:val="16"/>
                 <w:szCs w:val="16"/>
               </w:rPr>
-              <w:t xml:space="preserve">1. Enter existing ID </w:t>
+              <w:t xml:space="preserve">1. Enter the existing ID </w:t>
             </w:r>
             <w:r>
               <w:rPr>
@@ -2309,7 +2219,7 @@
                 <w:sz w:val="16"/>
                 <w:szCs w:val="16"/>
               </w:rPr>
-              <w:t xml:space="preserve">2. Enter boundary value </w:t>
+              <w:t xml:space="preserve">2. Enter the boundary value </w:t>
             </w:r>
             <w:r>
               <w:rPr>
@@ -2369,7 +2279,7 @@
                 <w:sz w:val="16"/>
                 <w:szCs w:val="16"/>
               </w:rPr>
-              <w:t xml:space="preserve">Functional search; boundary.</w:t>
+              <w:t xml:space="preserve">Functional, boundary</w:t>
             </w:r>
           </w:p>
         </w:tc>
@@ -2465,7 +2375,7 @@
                 <w:sz w:val="16"/>
                 <w:szCs w:val="16"/>
               </w:rPr>
-              <w:t xml:space="preserve">: “Product found using Binary Search” and a Search Result for Samsung TV 55". ID </w:t>
+              <w:t xml:space="preserve"> finds Samsung TV 55" and shows “Product found using Binary Search”. ID </w:t>
             </w:r>
             <w:r>
               <w:rPr>
@@ -2480,7 +2390,7 @@
                 <w:sz w:val="16"/>
                 <w:szCs w:val="16"/>
               </w:rPr>
-              <w:t xml:space="preserve">: “Product ID must be a positive number.”</w:t>
+              <w:t xml:space="preserve"> shows “Product ID must be a positive number.”</w:t>
             </w:r>
           </w:p>
         </w:tc>
@@ -2509,7 +2419,7 @@
                 <w:sz w:val="16"/>
                 <w:szCs w:val="16"/>
               </w:rPr>
-              <w:t xml:space="preserve">Search for ID </w:t>
+              <w:t xml:space="preserve">ID </w:t>
             </w:r>
             <w:r>
               <w:rPr>
@@ -2524,7 +2434,7 @@
                 <w:sz w:val="16"/>
                 <w:szCs w:val="16"/>
               </w:rPr>
-              <w:t xml:space="preserve"> (Samsung TV 55") showed “Product found using Binary Search (index: 0)” and a Search Result row (Samsung TV 55", Television, $499.99, stock 15). Search for </w:t>
+              <w:t xml:space="preserve"> showed “Product found using Binary Search (index: 0)” and a Search Result row: Samsung TV 55", Television, $499.99, stock 15. ID </w:t>
             </w:r>
             <w:r>
               <w:rPr>
@@ -2731,7 +2641,7 @@
                 <w:sz w:val="16"/>
                 <w:szCs w:val="16"/>
               </w:rPr>
-              <w:t xml:space="preserve">Verify regular-user authorization.</w:t>
+              <w:t xml:space="preserve">Check that a regular user cannot open the Users page.</w:t>
             </w:r>
           </w:p>
         </w:tc>
@@ -2817,7 +2727,7 @@
                 <w:sz w:val="16"/>
                 <w:szCs w:val="16"/>
               </w:rPr>
-              <w:t xml:space="preserve">2. Check the navbar for a Users link.</w:t>
+              <w:t xml:space="preserve">2. Look for a Users link in the navbar.</w:t>
             </w:r>
           </w:p>
           <w:p>
@@ -2844,7 +2754,7 @@
                 <w:sz w:val="16"/>
                 <w:szCs w:val="16"/>
               </w:rPr>
-              <w:t xml:space="preserve"> directly in the address bar.</w:t>
+              <w:t xml:space="preserve"> in the address bar.</w:t>
             </w:r>
           </w:p>
         </w:tc>
@@ -2873,7 +2783,7 @@
                 <w:sz w:val="16"/>
                 <w:szCs w:val="16"/>
               </w:rPr>
-              <w:t xml:space="preserve">Security/access-control.</w:t>
+              <w:t xml:space="preserve">Security, access control</w:t>
             </w:r>
           </w:p>
         </w:tc>
@@ -2969,7 +2879,22 @@
                 <w:sz w:val="16"/>
                 <w:szCs w:val="16"/>
               </w:rPr>
-              <w:t xml:space="preserve">Users link hidden; direct page redirects to dashboard.</w:t>
+              <w:t xml:space="preserve">The navbar has no Users link, and </w:t>
+            </w:r>
+            <w:r>
+              <w:rPr>
+                <w:rFonts w:ascii="Consolas" w:cs="Consolas" w:eastAsia="Consolas" w:hAnsi="Consolas"/>
+                <w:sz w:val="15"/>
+                <w:szCs w:val="15"/>
+              </w:rPr>
+              <w:t xml:space="preserve">users.php</w:t>
+            </w:r>
+            <w:r>
+              <w:rPr>
+                <w:sz w:val="16"/>
+                <w:szCs w:val="16"/>
+              </w:rPr>
+              <w:t xml:space="preserve"> redirects to the dashboard.</w:t>
             </w:r>
           </w:p>
         </w:tc>
@@ -2998,7 +2923,7 @@
                 <w:sz w:val="16"/>
                 <w:szCs w:val="16"/>
               </w:rPr>
-              <w:t xml:space="preserve">Signed in as </w:t>
+              <w:t xml:space="preserve">After login as </w:t>
             </w:r>
             <w:r>
               <w:rPr>
@@ -3013,22 +2938,7 @@
                 <w:sz w:val="16"/>
                 <w:szCs w:val="16"/>
               </w:rPr>
-              <w:t xml:space="preserve"> / </w:t>
-            </w:r>
-            <w:r>
-              <w:rPr>
-                <w:rFonts w:ascii="Consolas" w:cs="Consolas" w:eastAsia="Consolas" w:hAnsi="Consolas"/>
-                <w:sz w:val="15"/>
-                <w:szCs w:val="15"/>
-              </w:rPr>
-              <w:t xml:space="preserve">password</w:t>
-            </w:r>
-            <w:r>
-              <w:rPr>
-                <w:sz w:val="16"/>
-                <w:szCs w:val="16"/>
-              </w:rPr>
-              <w:t xml:space="preserve"> (“Regular User”): navbar shows Dashboard, Products, Sales, Reports, Profile with </w:t>
+              <w:t xml:space="preserve"> (“Regular User”) the navbar showed Dashboard, Products, Sales, Reports and Profile, with </w:t>
             </w:r>
             <w:r>
               <w:rPr>
@@ -3059,7 +2969,7 @@
                 <w:sz w:val="16"/>
                 <w:szCs w:val="16"/>
               </w:rPr>
-              <w:t xml:space="preserve"> directly redirected to </w:t>
+              <w:t xml:space="preserve"> redirected to </w:t>
             </w:r>
             <w:r>
               <w:rPr>
@@ -3074,7 +2984,7 @@
                 <w:sz w:val="16"/>
                 <w:szCs w:val="16"/>
               </w:rPr>
-              <w:t xml:space="preserve"> (dashboard), no user list shown. </w:t>
+              <w:t xml:space="preserve">, and no user list appeared. </w:t>
             </w:r>
             <w:r>
               <w:rPr>
@@ -3266,7 +3176,7 @@
                 <w:sz w:val="16"/>
                 <w:szCs w:val="16"/>
               </w:rPr>
-              <w:t xml:space="preserve">Verify valid sale processing.</w:t>
+              <w:t xml:space="preserve">Check that a sale updates the preview, the history and the stock.</w:t>
             </w:r>
           </w:p>
         </w:tc>
@@ -3350,7 +3260,7 @@
                 <w:sz w:val="16"/>
                 <w:szCs w:val="16"/>
               </w:rPr>
-              <w:t xml:space="preserve">2. Select Samsung TV 55" (Stock: 15), quantity </w:t>
+              <w:t xml:space="preserve">2. Select Samsung TV 55" (Stock: 15), enter quantity </w:t>
             </w:r>
             <w:r>
               <w:rPr>
@@ -3365,19 +3275,19 @@
                 <w:sz w:val="16"/>
                 <w:szCs w:val="16"/>
               </w:rPr>
-              <w:t xml:space="preserve">, sale date = today.</w:t>
-            </w:r>
-          </w:p>
-          <w:p>
-            <w:pPr>
-              <w:jc w:val="left"/>
-            </w:pPr>
-            <w:r>
-              <w:rPr>
-                <w:sz w:val="16"/>
-                <w:szCs w:val="16"/>
-              </w:rPr>
-              <w:t xml:space="preserve">3. Check the preview box.</w:t>
+              <w:t xml:space="preserve">, and keep today's date.</w:t>
+            </w:r>
+          </w:p>
+          <w:p>
+            <w:pPr>
+              <w:jc w:val="left"/>
+            </w:pPr>
+            <w:r>
+              <w:rPr>
+                <w:sz w:val="16"/>
+                <w:szCs w:val="16"/>
+              </w:rPr>
+              <w:t xml:space="preserve">3. Read the preview box.</w:t>
             </w:r>
           </w:p>
           <w:p>
@@ -3417,7 +3327,7 @@
                 <w:sz w:val="16"/>
                 <w:szCs w:val="16"/>
               </w:rPr>
-              <w:t xml:space="preserve">5. Check the alert, Sales History and stock.</w:t>
+              <w:t xml:space="preserve">5. Read the alert, the Sales History and the stock.</w:t>
             </w:r>
           </w:p>
         </w:tc>
@@ -3446,7 +3356,7 @@
                 <w:sz w:val="16"/>
                 <w:szCs w:val="16"/>
               </w:rPr>
-              <w:t xml:space="preserve">Functional integration/calculation.</w:t>
+              <w:t xml:space="preserve">Functional, calculation</w:t>
             </w:r>
           </w:p>
         </w:tc>
@@ -3557,7 +3467,7 @@
                 <w:sz w:val="16"/>
                 <w:szCs w:val="16"/>
               </w:rPr>
-              <w:t xml:space="preserve">Preview shows $499.99 and $999.98; sale appears in history; stock falls from 15 to 13.</w:t>
+              <w:t xml:space="preserve">The preview shows $499.99 and $999.98, the sale appears in the history, and stock drops from 15 to 13.</w:t>
             </w:r>
           </w:p>
         </w:tc>
@@ -3586,7 +3496,7 @@
                 <w:sz w:val="16"/>
                 <w:szCs w:val="16"/>
               </w:rPr>
-              <w:t xml:space="preserve">Samsung TV 55", qty 2, date 08/10/2026: preview showed Unit Price $499.99 and Estimated Revenue $999.98. After </w:t>
+              <w:t xml:space="preserve">The preview showed Unit Price $499.99 and Estimated Revenue $999.98. After </w:t>
             </w:r>
             <w:r>
               <w:rPr>
@@ -3602,7 +3512,7 @@
                 <w:sz w:val="16"/>
                 <w:szCs w:val="16"/>
               </w:rPr>
-              <w:t xml:space="preserve">: alert “Sale recorded! 2 unit(s) … New stock: 13 units.”, Sales History row #1 (qty 2, $499.99, $999.98, 08/10/2026); stock fell 15 → 13 (also confirmed in the database). </w:t>
+              <w:t xml:space="preserve"> the alert said “Sale recorded! 2 unit(s) … New stock: 13 units.” Sales History gained row #1 (quantity 2, $499.99, $999.98, 08/10/2026). Stock fell from 15 to 13, and the database shows the same. </w:t>
             </w:r>
             <w:r>
               <w:rPr>
@@ -3618,7 +3528,7 @@
                 <w:sz w:val="16"/>
                 <w:szCs w:val="16"/>
               </w:rPr>
-              <w:t xml:space="preserve"> Defect note: the alert prints the product name as </w:t>
+              <w:t xml:space="preserve"> Defect: the alert prints the product name as </w:t>
             </w:r>
             <w:r>
               <w:rPr>
@@ -3633,7 +3543,7 @@
                 <w:sz w:val="16"/>
                 <w:szCs w:val="16"/>
               </w:rPr>
-              <w:t xml:space="preserve"> (HTML entity shown literally – the message is escaped twice); cosmetic, does not affect the sale. Evidence: </w:t>
+              <w:t xml:space="preserve">. The app escapes the text twice, so the HTML entity appears as typed. The sale itself is correct. Evidence: </w:t>
             </w:r>
             <w:r>
               <w:rPr>
@@ -3809,7 +3719,7 @@
                 <w:sz w:val="16"/>
                 <w:szCs w:val="16"/>
               </w:rPr>
-              <w:t xml:space="preserve">Verify overselling is prevented.</w:t>
+              <w:t xml:space="preserve">Check that the app refuses to sell more than the stock.</w:t>
             </w:r>
           </w:p>
         </w:tc>
@@ -3853,7 +3763,7 @@
                 <w:sz w:val="16"/>
                 <w:szCs w:val="16"/>
               </w:rPr>
-              <w:t xml:space="preserve">; Wireless Mouse stock is 2 (seed value, not yet sold).</w:t>
+              <w:t xml:space="preserve">; Wireless Mouse stock is 2 (seed value, not sold yet).</w:t>
             </w:r>
           </w:p>
           <w:p>
@@ -3893,7 +3803,7 @@
                 <w:sz w:val="16"/>
                 <w:szCs w:val="16"/>
               </w:rPr>
-              <w:t xml:space="preserve">2. Select Wireless Mouse (Stock: 2), quantity </w:t>
+              <w:t xml:space="preserve">2. Select Wireless Mouse (Stock: 2), enter quantity </w:t>
             </w:r>
             <w:r>
               <w:rPr>
@@ -3908,7 +3818,7 @@
                 <w:sz w:val="16"/>
                 <w:szCs w:val="16"/>
               </w:rPr>
-              <w:t xml:space="preserve">, click </w:t>
+              <w:t xml:space="preserve"> and click </w:t>
             </w:r>
             <w:r>
               <w:rPr>
@@ -3924,7 +3834,7 @@
                 <w:sz w:val="16"/>
                 <w:szCs w:val="16"/>
               </w:rPr>
-              <w:t xml:space="preserve"> (the browser </w:t>
+              <w:t xml:space="preserve">. The browser </w:t>
             </w:r>
             <w:r>
               <w:rPr>
@@ -3939,19 +3849,19 @@
                 <w:sz w:val="16"/>
                 <w:szCs w:val="16"/>
               </w:rPr>
-              <w:t xml:space="preserve"> check blocks it first).</w:t>
-            </w:r>
-          </w:p>
-          <w:p>
-            <w:pPr>
-              <w:jc w:val="left"/>
-            </w:pPr>
-            <w:r>
-              <w:rPr>
-                <w:sz w:val="16"/>
-                <w:szCs w:val="16"/>
-              </w:rPr>
-              <w:t xml:space="preserve">3. Bypass the browser check (</w:t>
+              <w:t xml:space="preserve"> check blocks the form first.</w:t>
+            </w:r>
+          </w:p>
+          <w:p>
+            <w:pPr>
+              <w:jc w:val="left"/>
+            </w:pPr>
+            <w:r>
+              <w:rPr>
+                <w:sz w:val="16"/>
+                <w:szCs w:val="16"/>
+              </w:rPr>
+              <w:t xml:space="preserve">3. Turn off browser validation (</w:t>
             </w:r>
             <w:r>
               <w:rPr>
@@ -3978,7 +3888,7 @@
                 <w:sz w:val="16"/>
                 <w:szCs w:val="16"/>
               </w:rPr>
-              <w:t xml:space="preserve">4. Check the message, Sales History and stock.</w:t>
+              <w:t xml:space="preserve">4. Read the message, the Sales History and the stock.</w:t>
             </w:r>
           </w:p>
         </w:tc>
@@ -4007,7 +3917,7 @@
                 <w:sz w:val="16"/>
                 <w:szCs w:val="16"/>
               </w:rPr>
-              <w:t xml:space="preserve">Boundary/business-rule/data integrity.</w:t>
+              <w:t xml:space="preserve">Boundary, business rule</w:t>
             </w:r>
           </w:p>
         </w:tc>
@@ -4066,7 +3976,7 @@
                 <w:sz w:val="16"/>
                 <w:szCs w:val="16"/>
               </w:rPr>
-              <w:t xml:space="preserve"> (stock + 1, boundary violation)</w:t>
+              <w:t xml:space="preserve"> (one above the stock)</w:t>
             </w:r>
           </w:p>
         </w:tc>
@@ -4095,7 +4005,7 @@
                 <w:sz w:val="16"/>
                 <w:szCs w:val="16"/>
               </w:rPr>
-              <w:t xml:space="preserve">“Not enough stock” error; no sale; stock unchanged.</w:t>
+              <w:t xml:space="preserve">A “Not enough stock” error appears, no sale is recorded and the stock stays the same.</w:t>
             </w:r>
           </w:p>
         </w:tc>
@@ -4124,7 +4034,7 @@
                 <w:sz w:val="16"/>
                 <w:szCs w:val="16"/>
               </w:rPr>
-              <w:t xml:space="preserve">Wireless Mouse (stock 2), qty 3: the browser first blocked submission with the native tooltip “Value must be less than or equal to 2.” (the page sets </w:t>
+              <w:t xml:space="preserve">The browser blocked the form first with the tooltip “Value must be less than or equal to 2.” because the page sets </w:t>
             </w:r>
             <w:r>
               <w:rPr>
@@ -4139,7 +4049,7 @@
                 <w:sz w:val="16"/>
                 <w:szCs w:val="16"/>
               </w:rPr>
-              <w:t xml:space="preserve"> = stock; </w:t>
+              <w:t xml:space="preserve"> to the stock value (</w:t>
             </w:r>
             <w:r>
               <w:rPr>
@@ -4154,22 +4064,7 @@
                 <w:sz w:val="16"/>
                 <w:szCs w:val="16"/>
               </w:rPr>
-              <w:t xml:space="preserve">). With browser validation bypassed (</w:t>
-            </w:r>
-            <w:r>
-              <w:rPr>
-                <w:rFonts w:ascii="Consolas" w:cs="Consolas" w:eastAsia="Consolas" w:hAnsi="Consolas"/>
-                <w:sz w:val="15"/>
-                <w:szCs w:val="15"/>
-              </w:rPr>
-              <w:t xml:space="preserve">form.noValidate</w:t>
-            </w:r>
-            <w:r>
-              <w:rPr>
-                <w:sz w:val="16"/>
-                <w:szCs w:val="16"/>
-              </w:rPr>
-              <w:t xml:space="preserve">, no source change) the server returned “Not enough stock! Available: 2 units of 'Wireless Mouse'.”; no sale row was added (history still only #1) and mouse stock stayed 2. </w:t>
+              <w:t xml:space="preserve">). With browser validation off, the server answered “Not enough stock! Available: 2 units of 'Wireless Mouse'.” The history still held only sale #1, and the mouse stock stayed at 2. </w:t>
             </w:r>
             <w:r>
               <w:rPr>
@@ -4178,14 +4073,14 @@
                 <w:sz w:val="16"/>
                 <w:szCs w:val="16"/>
               </w:rPr>
-              <w:t xml:space="preserve">PASS</w:t>
-            </w:r>
-            <w:r>
-              <w:rPr>
-                <w:sz w:val="16"/>
-                <w:szCs w:val="16"/>
-              </w:rPr>
-              <w:t xml:space="preserve"> (two-layer protection). Evidence: </w:t>
+              <w:t xml:space="preserve">PASS.</w:t>
+            </w:r>
+            <w:r>
+              <w:rPr>
+                <w:sz w:val="16"/>
+                <w:szCs w:val="16"/>
+              </w:rPr>
+              <w:t xml:space="preserve"> The browser and the server each stop overselling. Evidence: </w:t>
             </w:r>
             <w:r>
               <w:rPr>
@@ -4361,7 +4256,7 @@
                 <w:sz w:val="16"/>
                 <w:szCs w:val="16"/>
               </w:rPr>
-              <w:t xml:space="preserve">Verify profile update and password protection.</w:t>
+              <w:t xml:space="preserve">Check the profile update and the wrong-password rejection.</w:t>
             </w:r>
           </w:p>
         </w:tc>
@@ -4460,7 +4355,7 @@
                 <w:sz w:val="16"/>
                 <w:szCs w:val="16"/>
               </w:rPr>
-              <w:t xml:space="preserve">, click </w:t>
+              <w:t xml:space="preserve"> and click </w:t>
             </w:r>
             <w:r>
               <w:rPr>
@@ -4488,7 +4383,7 @@
                 <w:sz w:val="16"/>
                 <w:szCs w:val="16"/>
               </w:rPr>
-              <w:t xml:space="preserve">3. In Change Password enter current </w:t>
+              <w:t xml:space="preserve">3. Under Change Password enter current password </w:t>
             </w:r>
             <w:r>
               <w:rPr>
@@ -4503,7 +4398,7 @@
                 <w:sz w:val="16"/>
                 <w:szCs w:val="16"/>
               </w:rPr>
-              <w:t xml:space="preserve">, new </w:t>
+              <w:t xml:space="preserve">, new password </w:t>
             </w:r>
             <w:r>
               <w:rPr>
@@ -4518,7 +4413,7 @@
                 <w:sz w:val="16"/>
                 <w:szCs w:val="16"/>
               </w:rPr>
-              <w:t xml:space="preserve">, confirm </w:t>
+              <w:t xml:space="preserve"> and confirmation </w:t>
             </w:r>
             <w:r>
               <w:rPr>
@@ -4533,7 +4428,7 @@
                 <w:sz w:val="16"/>
                 <w:szCs w:val="16"/>
               </w:rPr>
-              <w:t xml:space="preserve">, click </w:t>
+              <w:t xml:space="preserve">, then click </w:t>
             </w:r>
             <w:r>
               <w:rPr>
@@ -4590,7 +4485,7 @@
                 <w:sz w:val="16"/>
                 <w:szCs w:val="16"/>
               </w:rPr>
-              <w:t xml:space="preserve">Functional; invalid security validation.</w:t>
+              <w:t xml:space="preserve">Functional, invalid input</w:t>
             </w:r>
           </w:p>
         </w:tc>
@@ -4649,7 +4544,7 @@
                 <w:sz w:val="16"/>
                 <w:szCs w:val="16"/>
               </w:rPr>
-              <w:t xml:space="preserve"> (invalid); new / confirm password </w:t>
+              <w:t xml:space="preserve"> (wrong); new and confirm password </w:t>
             </w:r>
             <w:r>
               <w:rPr>
@@ -4686,7 +4581,7 @@
                 <w:sz w:val="16"/>
                 <w:szCs w:val="16"/>
               </w:rPr>
-              <w:t xml:space="preserve">Name updates; password change is rejected.</w:t>
+              <w:t xml:space="preserve">The name updates, and the password change fails with an error.</w:t>
             </w:r>
           </w:p>
         </w:tc>
@@ -4715,7 +4610,7 @@
                 <w:sz w:val="16"/>
                 <w:szCs w:val="16"/>
               </w:rPr>
-              <w:t xml:space="preserve">Full name changed to </w:t>
+              <w:t xml:space="preserve">The full name changed to </w:t>
             </w:r>
             <w:r>
               <w:rPr>
@@ -4730,7 +4625,7 @@
                 <w:sz w:val="16"/>
                 <w:szCs w:val="16"/>
               </w:rPr>
-              <w:t xml:space="preserve">: alert “Profile updated successfully!”, Account Information and navbar both show the new name. Password change with wrong current password (</w:t>
+              <w:t xml:space="preserve">. The alert said “Profile updated successfully!”, and both Account Information and the navbar showed the new name. The password change with the wrong current password (</w:t>
             </w:r>
             <w:r>
               <w:rPr>
@@ -4745,7 +4640,7 @@
                 <w:sz w:val="16"/>
                 <w:szCs w:val="16"/>
               </w:rPr>
-              <w:t xml:space="preserve">) was rejected with “Current password is incorrect.”; stored password unchanged. Name restored to “Administrator” after capture. </w:t>
+              <w:t xml:space="preserve">) failed with “Current password is incorrect.” The stored password did not change. The test restored the name “Administrator” afterward. </w:t>
             </w:r>
             <w:r>
               <w:rPr>
@@ -4937,7 +4832,7 @@
                 <w:sz w:val="16"/>
                 <w:szCs w:val="16"/>
               </w:rPr>
-              <w:t xml:space="preserve">Verify date-filtered report totals.</w:t>
+              <w:t xml:space="preserve">Check that the report filters by date.</w:t>
             </w:r>
           </w:p>
         </w:tc>
@@ -4966,7 +4861,7 @@
                 <w:sz w:val="16"/>
                 <w:szCs w:val="16"/>
               </w:rPr>
-              <w:t xml:space="preserve">Pre: TC07 sale recorded today (tests must run in order).</w:t>
+              <w:t xml:space="preserve">Pre: the TC07 sale exists (run the tests in order).</w:t>
             </w:r>
           </w:p>
           <w:p>
@@ -5109,7 +5004,7 @@
                 <w:sz w:val="16"/>
                 <w:szCs w:val="16"/>
               </w:rPr>
-              <w:t xml:space="preserve">Functional aggregation/date filtering.</w:t>
+              <w:t xml:space="preserve">Functional, date filter and totals</w:t>
             </w:r>
           </w:p>
         </w:tc>
@@ -5205,7 +5100,7 @@
                 <w:sz w:val="16"/>
                 <w:szCs w:val="16"/>
               </w:rPr>
-              <w:t xml:space="preserve">Correct row/totals for sale date; no-sales warning and zero totals for other date.</w:t>
+              <w:t xml:space="preserve">The sale date shows the Samsung TV row and correct totals. The no-sales date shows a warning and zero totals.</w:t>
             </w:r>
           </w:p>
         </w:tc>
@@ -5234,7 +5129,7 @@
                 <w:sz w:val="16"/>
                 <w:szCs w:val="16"/>
               </w:rPr>
-              <w:t xml:space="preserve">Report for 08/10/2026 (Test 7 sale date): Samsung TV 55" row shows 2 units sold, 13 remaining, $999.98; totals 2 units / $999.98 / 289 in stock / 9 products. Report for 01/01/2020 showed warning “No sales were recorded on 01/01/2020. The table below shows current inventory levels only.” with 0 units and $0.00 totals. </w:t>
+              <w:t xml:space="preserve">The report for 08/10/2026 (the TC07 sale date) showed the Samsung TV 55" row with 2 units sold, 13 remaining and $999.98. Totals: 2 units, $999.98, 289 in stock, 9 products. The report for 01/01/2020 showed “No sales were recorded on 01/01/2020. The table below shows current inventory levels only.” with 0 units and $0.00 totals. </w:t>
             </w:r>
             <w:r>
               <w:rPr>

</xml_diff>

<commit_message>
Add actual-result text under each evidence screenshot in docx
Co-Authored-By: Claude Sonnet 5.5 <noreply@anthropic.com>
</commit_message>
<xml_diff>
--- a/Testing_Results_Table.docx
+++ b/Testing_Results_Table.docx
@@ -7137,7 +7137,7 @@
     </w:p>
     <w:p>
       <w:pPr>
-        <w:spacing w:after="240"/>
+        <w:spacing w:after="80"/>
       </w:pPr>
       <w:r>
         <w:drawing>
@@ -7182,6 +7182,58 @@
     </w:p>
     <w:p>
       <w:pPr>
+        <w:spacing w:after="280"/>
+      </w:pPr>
+      <w:r>
+        <w:rPr>
+          <w:sz w:val="18"/>
+          <w:szCs w:val="18"/>
+        </w:rPr>
+        <w:t xml:space="preserve">Actual result (Test 1): The browser went to </w:t>
+      </w:r>
+      <w:r>
+        <w:rPr>
+          <w:rFonts w:ascii="Consolas" w:cs="Consolas" w:eastAsia="Consolas" w:hAnsi="Consolas"/>
+          <w:sz w:val="17"/>
+          <w:szCs w:val="17"/>
+        </w:rPr>
+        <w:t xml:space="preserve">index.php</w:t>
+      </w:r>
+      <w:r>
+        <w:rPr>
+          <w:sz w:val="18"/>
+          <w:szCs w:val="18"/>
+        </w:rPr>
+        <w:t xml:space="preserve">. The dashboard showed the summary cards and the </w:t>
+      </w:r>
+      <w:r>
+        <w:rPr>
+          <w:b/>
+          <w:bCs/>
+          <w:sz w:val="18"/>
+          <w:szCs w:val="18"/>
+        </w:rPr>
+        <w:t xml:space="preserve">Users</w:t>
+      </w:r>
+      <w:r>
+        <w:rPr>
+          <w:sz w:val="18"/>
+          <w:szCs w:val="18"/>
+        </w:rPr>
+        <w:t xml:space="preserve"> link, and the navbar showed “Administrator”. </w:t>
+      </w:r>
+      <w:r>
+        <w:rPr>
+          <w:b/>
+          <w:bCs/>
+          <w:sz w:val="18"/>
+          <w:szCs w:val="18"/>
+        </w:rPr>
+        <w:t xml:space="preserve">PASS.</w:t>
+      </w:r>
+    </w:p>
+    <w:p>
+      <w:pPr>
         <w:pStyle w:val="Heading3"/>
         <w:keepNext/>
       </w:pPr>
@@ -7191,7 +7243,7 @@
     </w:p>
     <w:p>
       <w:pPr>
-        <w:spacing w:after="240"/>
+        <w:spacing w:after="80"/>
       </w:pPr>
       <w:r>
         <w:drawing>
@@ -7236,6 +7288,57 @@
     </w:p>
     <w:p>
       <w:pPr>
+        <w:spacing w:after="280"/>
+      </w:pPr>
+      <w:r>
+        <w:rPr>
+          <w:sz w:val="18"/>
+          <w:szCs w:val="18"/>
+        </w:rPr>
+        <w:t xml:space="preserve">Actual result (Test 2): The browser stayed on </w:t>
+      </w:r>
+      <w:r>
+        <w:rPr>
+          <w:rFonts w:ascii="Consolas" w:cs="Consolas" w:eastAsia="Consolas" w:hAnsi="Consolas"/>
+          <w:sz w:val="17"/>
+          <w:szCs w:val="17"/>
+        </w:rPr>
+        <w:t xml:space="preserve">login.php</w:t>
+      </w:r>
+      <w:r>
+        <w:rPr>
+          <w:sz w:val="18"/>
+          <w:szCs w:val="18"/>
+        </w:rPr>
+        <w:t xml:space="preserve"> and showed a red alert, “Invalid username or password.” The username field kept </w:t>
+      </w:r>
+      <w:r>
+        <w:rPr>
+          <w:rFonts w:ascii="Consolas" w:cs="Consolas" w:eastAsia="Consolas" w:hAnsi="Consolas"/>
+          <w:sz w:val="17"/>
+          <w:szCs w:val="17"/>
+        </w:rPr>
+        <w:t xml:space="preserve">admin</w:t>
+      </w:r>
+      <w:r>
+        <w:rPr>
+          <w:sz w:val="18"/>
+          <w:szCs w:val="18"/>
+        </w:rPr>
+        <w:t xml:space="preserve">, the password field was empty, and no dashboard opened. </w:t>
+      </w:r>
+      <w:r>
+        <w:rPr>
+          <w:b/>
+          <w:bCs/>
+          <w:sz w:val="18"/>
+          <w:szCs w:val="18"/>
+        </w:rPr>
+        <w:t xml:space="preserve">PASS.</w:t>
+      </w:r>
+    </w:p>
+    <w:p>
+      <w:pPr>
         <w:pStyle w:val="Heading3"/>
         <w:keepNext/>
       </w:pPr>
@@ -7245,7 +7348,7 @@
     </w:p>
     <w:p>
       <w:pPr>
-        <w:spacing w:after="240"/>
+        <w:spacing w:after="80"/>
       </w:pPr>
       <w:r>
         <w:drawing>
@@ -7290,6 +7393,57 @@
     </w:p>
     <w:p>
       <w:pPr>
+        <w:spacing w:after="280"/>
+      </w:pPr>
+      <w:r>
+        <w:rPr>
+          <w:sz w:val="18"/>
+          <w:szCs w:val="18"/>
+        </w:rPr>
+        <w:t xml:space="preserve">Actual result (Test 3): The page showed “Account created. You can now sign in.” Login with </w:t>
+      </w:r>
+      <w:r>
+        <w:rPr>
+          <w:rFonts w:ascii="Consolas" w:cs="Consolas" w:eastAsia="Consolas" w:hAnsi="Consolas"/>
+          <w:sz w:val="17"/>
+          <w:szCs w:val="17"/>
+        </w:rPr>
+        <w:t xml:space="preserve">abc</w:t>
+      </w:r>
+      <w:r>
+        <w:rPr>
+          <w:sz w:val="18"/>
+          <w:szCs w:val="18"/>
+        </w:rPr>
+        <w:t xml:space="preserve"> / </w:t>
+      </w:r>
+      <w:r>
+        <w:rPr>
+          <w:rFonts w:ascii="Consolas" w:cs="Consolas" w:eastAsia="Consolas" w:hAnsi="Consolas"/>
+          <w:sz w:val="17"/>
+          <w:szCs w:val="17"/>
+        </w:rPr>
+        <w:t xml:space="preserve">pass</w:t>
+      </w:r>
+      <w:r>
+        <w:rPr>
+          <w:sz w:val="18"/>
+          <w:szCs w:val="18"/>
+        </w:rPr>
+        <w:t xml:space="preserve"> opened the dashboard. </w:t>
+      </w:r>
+      <w:r>
+        <w:rPr>
+          <w:b/>
+          <w:bCs/>
+          <w:sz w:val="18"/>
+          <w:szCs w:val="18"/>
+        </w:rPr>
+        <w:t xml:space="preserve">PASS.</w:t>
+      </w:r>
+    </w:p>
+    <w:p>
+      <w:pPr>
         <w:pStyle w:val="Heading3"/>
         <w:keepNext/>
       </w:pPr>
@@ -7299,7 +7453,7 @@
     </w:p>
     <w:p>
       <w:pPr>
-        <w:spacing w:after="240"/>
+        <w:spacing w:after="80"/>
       </w:pPr>
       <w:r>
         <w:drawing>
@@ -7344,6 +7498,57 @@
     </w:p>
     <w:p>
       <w:pPr>
+        <w:spacing w:after="280"/>
+      </w:pPr>
+      <w:r>
+        <w:rPr>
+          <w:sz w:val="18"/>
+          <w:szCs w:val="18"/>
+        </w:rPr>
+        <w:t xml:space="preserve">Actual result (Test 4): The page stayed on </w:t>
+      </w:r>
+      <w:r>
+        <w:rPr>
+          <w:rFonts w:ascii="Consolas" w:cs="Consolas" w:eastAsia="Consolas" w:hAnsi="Consolas"/>
+          <w:sz w:val="17"/>
+          <w:szCs w:val="17"/>
+        </w:rPr>
+        <w:t xml:space="preserve">register.php</w:t>
+      </w:r>
+      <w:r>
+        <w:rPr>
+          <w:sz w:val="18"/>
+          <w:szCs w:val="18"/>
+        </w:rPr>
+        <w:t xml:space="preserve"> and showed “Username must be at least 3 characters.” The form kept </w:t>
+      </w:r>
+      <w:r>
+        <w:rPr>
+          <w:rFonts w:ascii="Consolas" w:cs="Consolas" w:eastAsia="Consolas" w:hAnsi="Consolas"/>
+          <w:sz w:val="17"/>
+          <w:szCs w:val="17"/>
+        </w:rPr>
+        <w:t xml:space="preserve">ab</w:t>
+      </w:r>
+      <w:r>
+        <w:rPr>
+          <w:sz w:val="18"/>
+          <w:szCs w:val="18"/>
+        </w:rPr>
+        <w:t xml:space="preserve"> and cleared both password fields. No account was created. </w:t>
+      </w:r>
+      <w:r>
+        <w:rPr>
+          <w:b/>
+          <w:bCs/>
+          <w:sz w:val="18"/>
+          <w:szCs w:val="18"/>
+        </w:rPr>
+        <w:t xml:space="preserve">PASS.</w:t>
+      </w:r>
+    </w:p>
+    <w:p>
+      <w:pPr>
         <w:pStyle w:val="Heading3"/>
         <w:keepNext/>
       </w:pPr>
@@ -7353,7 +7558,7 @@
     </w:p>
     <w:p>
       <w:pPr>
-        <w:spacing w:after="240"/>
+        <w:spacing w:after="80"/>
       </w:pPr>
       <w:r>
         <w:drawing>
@@ -7398,6 +7603,27 @@
     </w:p>
     <w:p>
       <w:pPr>
+        <w:spacing w:after="280"/>
+      </w:pPr>
+      <w:r>
+        <w:rPr>
+          <w:sz w:val="18"/>
+          <w:szCs w:val="18"/>
+        </w:rPr>
+        <w:t xml:space="preserve">Actual result (Test 5): The alert “Product 'Test Wireless Charger' added successfully!” appeared. The table lists ID 9, Test Wireless Charger, Accessories, $29.99, stock 10. </w:t>
+      </w:r>
+      <w:r>
+        <w:rPr>
+          <w:b/>
+          <w:bCs/>
+          <w:sz w:val="18"/>
+          <w:szCs w:val="18"/>
+        </w:rPr>
+        <w:t xml:space="preserve">PASS.</w:t>
+      </w:r>
+    </w:p>
+    <w:p>
+      <w:pPr>
         <w:pStyle w:val="Heading3"/>
         <w:keepNext/>
       </w:pPr>
@@ -7407,7 +7633,7 @@
     </w:p>
     <w:p>
       <w:pPr>
-        <w:spacing w:after="240"/>
+        <w:spacing w:after="80"/>
       </w:pPr>
       <w:r>
         <w:drawing>
@@ -7452,6 +7678,43 @@
     </w:p>
     <w:p>
       <w:pPr>
+        <w:spacing w:after="280"/>
+      </w:pPr>
+      <w:r>
+        <w:rPr>
+          <w:sz w:val="18"/>
+          <w:szCs w:val="18"/>
+        </w:rPr>
+        <w:t xml:space="preserve">Actual result (Test 6): The alert “Product 'Test Cable' added successfully!” appeared. The table (10 products) lists ID 10, Test Cable, Accessories, $0.01, with an </w:t>
+      </w:r>
+      <w:r>
+        <w:rPr>
+          <w:b/>
+          <w:bCs/>
+          <w:sz w:val="18"/>
+          <w:szCs w:val="18"/>
+        </w:rPr>
+        <w:t xml:space="preserve">Out of Stock</w:t>
+      </w:r>
+      <w:r>
+        <w:rPr>
+          <w:sz w:val="18"/>
+          <w:szCs w:val="18"/>
+        </w:rPr>
+        <w:t xml:space="preserve"> badge for stock 0. </w:t>
+      </w:r>
+      <w:r>
+        <w:rPr>
+          <w:b/>
+          <w:bCs/>
+          <w:sz w:val="18"/>
+          <w:szCs w:val="18"/>
+        </w:rPr>
+        <w:t xml:space="preserve">PASS.</w:t>
+      </w:r>
+    </w:p>
+    <w:p>
+      <w:pPr>
         <w:pStyle w:val="Heading3"/>
         <w:keepNext/>
       </w:pPr>
@@ -7461,7 +7724,7 @@
     </w:p>
     <w:p>
       <w:pPr>
-        <w:spacing w:after="240"/>
+        <w:spacing w:after="80"/>
       </w:pPr>
       <w:r>
         <w:drawing>
@@ -7506,6 +7769,27 @@
     </w:p>
     <w:p>
       <w:pPr>
+        <w:spacing w:after="280"/>
+      </w:pPr>
+      <w:r>
+        <w:rPr>
+          <w:sz w:val="18"/>
+          <w:szCs w:val="18"/>
+        </w:rPr>
+        <w:t xml:space="preserve">Actual result (Test 7): The page showed “Product found using Binary Search (index: 0)” and a Search Result row: ID 1, Samsung TV 55", Television, $499.99, stock 15. </w:t>
+      </w:r>
+      <w:r>
+        <w:rPr>
+          <w:b/>
+          <w:bCs/>
+          <w:sz w:val="18"/>
+          <w:szCs w:val="18"/>
+        </w:rPr>
+        <w:t xml:space="preserve">PASS.</w:t>
+      </w:r>
+    </w:p>
+    <w:p>
+      <w:pPr>
         <w:pStyle w:val="Heading3"/>
         <w:keepNext/>
       </w:pPr>
@@ -7515,7 +7799,7 @@
     </w:p>
     <w:p>
       <w:pPr>
-        <w:spacing w:after="240"/>
+        <w:spacing w:after="80"/>
       </w:pPr>
       <w:r>
         <w:drawing>
@@ -7560,6 +7844,27 @@
     </w:p>
     <w:p>
       <w:pPr>
+        <w:spacing w:after="280"/>
+      </w:pPr>
+      <w:r>
+        <w:rPr>
+          <w:sz w:val="18"/>
+          <w:szCs w:val="18"/>
+        </w:rPr>
+        <w:t xml:space="preserve">Actual result (Test 8): The page showed “Product ID must be a positive number.” and no Search Result panel. </w:t>
+      </w:r>
+      <w:r>
+        <w:rPr>
+          <w:b/>
+          <w:bCs/>
+          <w:sz w:val="18"/>
+          <w:szCs w:val="18"/>
+        </w:rPr>
+        <w:t xml:space="preserve">PASS.</w:t>
+      </w:r>
+    </w:p>
+    <w:p>
+      <w:pPr>
         <w:pStyle w:val="Heading3"/>
         <w:keepNext/>
       </w:pPr>
@@ -7569,7 +7874,7 @@
     </w:p>
     <w:p>
       <w:pPr>
-        <w:spacing w:after="240"/>
+        <w:spacing w:after="80"/>
       </w:pPr>
       <w:r>
         <w:drawing>
@@ -7614,6 +7919,73 @@
     </w:p>
     <w:p>
       <w:pPr>
+        <w:spacing w:after="280"/>
+      </w:pPr>
+      <w:r>
+        <w:rPr>
+          <w:sz w:val="18"/>
+          <w:szCs w:val="18"/>
+        </w:rPr>
+        <w:t xml:space="preserve">Actual result (Test 9): The navbar showed “Regular User” with Dashboard, Products, Sales and Reports, and </w:t>
+      </w:r>
+      <w:r>
+        <w:rPr>
+          <w:b/>
+          <w:bCs/>
+          <w:sz w:val="18"/>
+          <w:szCs w:val="18"/>
+        </w:rPr>
+        <w:t xml:space="preserve">no Users link</w:t>
+      </w:r>
+      <w:r>
+        <w:rPr>
+          <w:sz w:val="18"/>
+          <w:szCs w:val="18"/>
+        </w:rPr>
+        <w:t xml:space="preserve">. Opening </w:t>
+      </w:r>
+      <w:r>
+        <w:rPr>
+          <w:rFonts w:ascii="Consolas" w:cs="Consolas" w:eastAsia="Consolas" w:hAnsi="Consolas"/>
+          <w:sz w:val="17"/>
+          <w:szCs w:val="17"/>
+        </w:rPr>
+        <w:t xml:space="preserve">users.php</w:t>
+      </w:r>
+      <w:r>
+        <w:rPr>
+          <w:sz w:val="18"/>
+          <w:szCs w:val="18"/>
+        </w:rPr>
+        <w:t xml:space="preserve"> redirected to </w:t>
+      </w:r>
+      <w:r>
+        <w:rPr>
+          <w:rFonts w:ascii="Consolas" w:cs="Consolas" w:eastAsia="Consolas" w:hAnsi="Consolas"/>
+          <w:sz w:val="17"/>
+          <w:szCs w:val="17"/>
+        </w:rPr>
+        <w:t xml:space="preserve">index.php</w:t>
+      </w:r>
+      <w:r>
+        <w:rPr>
+          <w:sz w:val="18"/>
+          <w:szCs w:val="18"/>
+        </w:rPr>
+        <w:t xml:space="preserve">, and no user list appeared. </w:t>
+      </w:r>
+      <w:r>
+        <w:rPr>
+          <w:b/>
+          <w:bCs/>
+          <w:sz w:val="18"/>
+          <w:szCs w:val="18"/>
+        </w:rPr>
+        <w:t xml:space="preserve">PASS.</w:t>
+      </w:r>
+    </w:p>
+    <w:p>
+      <w:pPr>
         <w:pStyle w:val="Heading3"/>
         <w:keepNext/>
       </w:pPr>
@@ -7623,7 +7995,7 @@
     </w:p>
     <w:p>
       <w:pPr>
-        <w:spacing w:after="240"/>
+        <w:spacing w:after="80"/>
       </w:pPr>
       <w:r>
         <w:drawing>
@@ -7668,6 +8040,65 @@
     </w:p>
     <w:p>
       <w:pPr>
+        <w:spacing w:after="280"/>
+      </w:pPr>
+      <w:r>
+        <w:rPr>
+          <w:sz w:val="18"/>
+          <w:szCs w:val="18"/>
+        </w:rPr>
+        <w:t xml:space="preserve">Actual result (Test 10): The preview showed Unit Price $499.99 and Estimated Revenue $999.98. After </w:t>
+      </w:r>
+      <w:r>
+        <w:rPr>
+          <w:b/>
+          <w:bCs/>
+          <w:sz w:val="18"/>
+          <w:szCs w:val="18"/>
+        </w:rPr>
+        <w:t xml:space="preserve">Record Sale</w:t>
+      </w:r>
+      <w:r>
+        <w:rPr>
+          <w:sz w:val="18"/>
+          <w:szCs w:val="18"/>
+        </w:rPr>
+        <w:t xml:space="preserve"> the alert said “Sale recorded! 2 unit(s) … New stock: 13 units.” Sales History gained row #1 (quantity 2, $499.99, $999.98, 08/10/2026). </w:t>
+      </w:r>
+      <w:r>
+        <w:rPr>
+          <w:b/>
+          <w:bCs/>
+          <w:sz w:val="18"/>
+          <w:szCs w:val="18"/>
+        </w:rPr>
+        <w:t xml:space="preserve">PASS.</w:t>
+      </w:r>
+      <w:r>
+        <w:rPr>
+          <w:sz w:val="18"/>
+          <w:szCs w:val="18"/>
+        </w:rPr>
+        <w:t xml:space="preserve"> Defect: the alert prints the product name as </w:t>
+      </w:r>
+      <w:r>
+        <w:rPr>
+          <w:rFonts w:ascii="Consolas" w:cs="Consolas" w:eastAsia="Consolas" w:hAnsi="Consolas"/>
+          <w:sz w:val="17"/>
+          <w:szCs w:val="17"/>
+        </w:rPr>
+        <w:t xml:space="preserve">'Samsung TV 55&amp;quot;'</w:t>
+      </w:r>
+      <w:r>
+        <w:rPr>
+          <w:sz w:val="18"/>
+          <w:szCs w:val="18"/>
+        </w:rPr>
+        <w:t xml:space="preserve">. The app escapes the text twice, so the HTML entity appears as typed. The sale itself is correct.</w:t>
+      </w:r>
+    </w:p>
+    <w:p>
+      <w:pPr>
         <w:pStyle w:val="Heading3"/>
         <w:keepNext/>
       </w:pPr>
@@ -7677,7 +8108,7 @@
     </w:p>
     <w:p>
       <w:pPr>
-        <w:spacing w:after="240"/>
+        <w:spacing w:after="80"/>
       </w:pPr>
       <w:r>
         <w:drawing>
@@ -7722,6 +8153,65 @@
     </w:p>
     <w:p>
       <w:pPr>
+        <w:spacing w:after="280"/>
+      </w:pPr>
+      <w:r>
+        <w:rPr>
+          <w:sz w:val="18"/>
+          <w:szCs w:val="18"/>
+        </w:rPr>
+        <w:t xml:space="preserve">Actual result (Test 10): The preview showed Unit Price $499.99 and Estimated Revenue $999.98. After </w:t>
+      </w:r>
+      <w:r>
+        <w:rPr>
+          <w:b/>
+          <w:bCs/>
+          <w:sz w:val="18"/>
+          <w:szCs w:val="18"/>
+        </w:rPr>
+        <w:t xml:space="preserve">Record Sale</w:t>
+      </w:r>
+      <w:r>
+        <w:rPr>
+          <w:sz w:val="18"/>
+          <w:szCs w:val="18"/>
+        </w:rPr>
+        <w:t xml:space="preserve"> the alert said “Sale recorded! 2 unit(s) … New stock: 13 units.” Sales History gained row #1 (quantity 2, $499.99, $999.98, 08/10/2026). </w:t>
+      </w:r>
+      <w:r>
+        <w:rPr>
+          <w:b/>
+          <w:bCs/>
+          <w:sz w:val="18"/>
+          <w:szCs w:val="18"/>
+        </w:rPr>
+        <w:t xml:space="preserve">PASS.</w:t>
+      </w:r>
+      <w:r>
+        <w:rPr>
+          <w:sz w:val="18"/>
+          <w:szCs w:val="18"/>
+        </w:rPr>
+        <w:t xml:space="preserve"> Defect: the alert prints the product name as </w:t>
+      </w:r>
+      <w:r>
+        <w:rPr>
+          <w:rFonts w:ascii="Consolas" w:cs="Consolas" w:eastAsia="Consolas" w:hAnsi="Consolas"/>
+          <w:sz w:val="17"/>
+          <w:szCs w:val="17"/>
+        </w:rPr>
+        <w:t xml:space="preserve">'Samsung TV 55&amp;quot;'</w:t>
+      </w:r>
+      <w:r>
+        <w:rPr>
+          <w:sz w:val="18"/>
+          <w:szCs w:val="18"/>
+        </w:rPr>
+        <w:t xml:space="preserve">. The app escapes the text twice, so the HTML entity appears as typed. The sale itself is correct.</w:t>
+      </w:r>
+    </w:p>
+    <w:p>
+      <w:pPr>
         <w:pStyle w:val="Heading3"/>
         <w:keepNext/>
       </w:pPr>
@@ -7731,7 +8221,7 @@
     </w:p>
     <w:p>
       <w:pPr>
-        <w:spacing w:after="240"/>
+        <w:spacing w:after="80"/>
       </w:pPr>
       <w:r>
         <w:drawing>
@@ -7776,6 +8266,64 @@
     </w:p>
     <w:p>
       <w:pPr>
+        <w:spacing w:after="280"/>
+      </w:pPr>
+      <w:r>
+        <w:rPr>
+          <w:sz w:val="18"/>
+          <w:szCs w:val="18"/>
+        </w:rPr>
+        <w:t xml:space="preserve">Actual result (Test 11): The browser blocked the form first with the tooltip “Value must be less than or equal to 2.” because the page sets </w:t>
+      </w:r>
+      <w:r>
+        <w:rPr>
+          <w:rFonts w:ascii="Consolas" w:cs="Consolas" w:eastAsia="Consolas" w:hAnsi="Consolas"/>
+          <w:sz w:val="17"/>
+          <w:szCs w:val="17"/>
+        </w:rPr>
+        <w:t xml:space="preserve">max</w:t>
+      </w:r>
+      <w:r>
+        <w:rPr>
+          <w:sz w:val="18"/>
+          <w:szCs w:val="18"/>
+        </w:rPr>
+        <w:t xml:space="preserve"> to the stock value (</w:t>
+      </w:r>
+      <w:r>
+        <w:rPr>
+          <w:rFonts w:ascii="Consolas" w:cs="Consolas" w:eastAsia="Consolas" w:hAnsi="Consolas"/>
+          <w:sz w:val="17"/>
+          <w:szCs w:val="17"/>
+        </w:rPr>
+        <w:t xml:space="preserve">evidence/TC11_client_validation.png</w:t>
+      </w:r>
+      <w:r>
+        <w:rPr>
+          <w:sz w:val="18"/>
+          <w:szCs w:val="18"/>
+        </w:rPr>
+        <w:t xml:space="preserve">). With browser validation off, the server answered “Not enough stock! Available: 2 units of 'Wireless Mouse'.” The history still held only sale #1, and the mouse stock stayed at 2. </w:t>
+      </w:r>
+      <w:r>
+        <w:rPr>
+          <w:b/>
+          <w:bCs/>
+          <w:sz w:val="18"/>
+          <w:szCs w:val="18"/>
+        </w:rPr>
+        <w:t xml:space="preserve">PASS.</w:t>
+      </w:r>
+      <w:r>
+        <w:rPr>
+          <w:sz w:val="18"/>
+          <w:szCs w:val="18"/>
+        </w:rPr>
+        <w:t xml:space="preserve"> The browser and the server each stop overselling.</w:t>
+      </w:r>
+    </w:p>
+    <w:p>
+      <w:pPr>
         <w:pStyle w:val="Heading3"/>
         <w:keepNext/>
       </w:pPr>
@@ -7785,7 +8333,7 @@
     </w:p>
     <w:p>
       <w:pPr>
-        <w:spacing w:after="240"/>
+        <w:spacing w:after="80"/>
       </w:pPr>
       <w:r>
         <w:drawing>
@@ -7830,6 +8378,64 @@
     </w:p>
     <w:p>
       <w:pPr>
+        <w:spacing w:after="280"/>
+      </w:pPr>
+      <w:r>
+        <w:rPr>
+          <w:sz w:val="18"/>
+          <w:szCs w:val="18"/>
+        </w:rPr>
+        <w:t xml:space="preserve">Actual result (Test 11): The browser blocked the form first with the tooltip “Value must be less than or equal to 2.” because the page sets </w:t>
+      </w:r>
+      <w:r>
+        <w:rPr>
+          <w:rFonts w:ascii="Consolas" w:cs="Consolas" w:eastAsia="Consolas" w:hAnsi="Consolas"/>
+          <w:sz w:val="17"/>
+          <w:szCs w:val="17"/>
+        </w:rPr>
+        <w:t xml:space="preserve">max</w:t>
+      </w:r>
+      <w:r>
+        <w:rPr>
+          <w:sz w:val="18"/>
+          <w:szCs w:val="18"/>
+        </w:rPr>
+        <w:t xml:space="preserve"> to the stock value (</w:t>
+      </w:r>
+      <w:r>
+        <w:rPr>
+          <w:rFonts w:ascii="Consolas" w:cs="Consolas" w:eastAsia="Consolas" w:hAnsi="Consolas"/>
+          <w:sz w:val="17"/>
+          <w:szCs w:val="17"/>
+        </w:rPr>
+        <w:t xml:space="preserve">evidence/TC11_client_validation.png</w:t>
+      </w:r>
+      <w:r>
+        <w:rPr>
+          <w:sz w:val="18"/>
+          <w:szCs w:val="18"/>
+        </w:rPr>
+        <w:t xml:space="preserve">). With browser validation off, the server answered “Not enough stock! Available: 2 units of 'Wireless Mouse'.” The history still held only sale #1, and the mouse stock stayed at 2. </w:t>
+      </w:r>
+      <w:r>
+        <w:rPr>
+          <w:b/>
+          <w:bCs/>
+          <w:sz w:val="18"/>
+          <w:szCs w:val="18"/>
+        </w:rPr>
+        <w:t xml:space="preserve">PASS.</w:t>
+      </w:r>
+      <w:r>
+        <w:rPr>
+          <w:sz w:val="18"/>
+          <w:szCs w:val="18"/>
+        </w:rPr>
+        <w:t xml:space="preserve"> The browser and the server each stop overselling.</w:t>
+      </w:r>
+    </w:p>
+    <w:p>
+      <w:pPr>
         <w:pStyle w:val="Heading3"/>
         <w:keepNext/>
       </w:pPr>
@@ -7839,7 +8445,7 @@
     </w:p>
     <w:p>
       <w:pPr>
-        <w:spacing w:after="240"/>
+        <w:spacing w:after="80"/>
       </w:pPr>
       <w:r>
         <w:drawing>
@@ -7884,6 +8490,27 @@
     </w:p>
     <w:p>
       <w:pPr>
+        <w:spacing w:after="280"/>
+      </w:pPr>
+      <w:r>
+        <w:rPr>
+          <w:sz w:val="18"/>
+          <w:szCs w:val="18"/>
+        </w:rPr>
+        <w:t xml:space="preserve">Actual result (Test 12): The alert said “Sale recorded! 2 unit(s) of 'Wireless Mouse' sold. New stock: 0 units.” Sales History gained row #2 (quantity 2, $25.99, $51.98, 08/10/2026). Wireless Mouse no longer appears in Select Product. </w:t>
+      </w:r>
+      <w:r>
+        <w:rPr>
+          <w:b/>
+          <w:bCs/>
+          <w:sz w:val="18"/>
+          <w:szCs w:val="18"/>
+        </w:rPr>
+        <w:t xml:space="preserve">PASS.</w:t>
+      </w:r>
+    </w:p>
+    <w:p>
+      <w:pPr>
         <w:pStyle w:val="Heading3"/>
         <w:keepNext/>
       </w:pPr>
@@ -7893,7 +8520,7 @@
     </w:p>
     <w:p>
       <w:pPr>
-        <w:spacing w:after="240"/>
+        <w:spacing w:after="80"/>
       </w:pPr>
       <w:r>
         <w:drawing>
@@ -7938,6 +8565,42 @@
     </w:p>
     <w:p>
       <w:pPr>
+        <w:spacing w:after="280"/>
+      </w:pPr>
+      <w:r>
+        <w:rPr>
+          <w:sz w:val="18"/>
+          <w:szCs w:val="18"/>
+        </w:rPr>
+        <w:t xml:space="preserve">Actual result (Test 13): The alert said “Profile updated successfully!”, and both Account Information and the navbar showed </w:t>
+      </w:r>
+      <w:r>
+        <w:rPr>
+          <w:rFonts w:ascii="Consolas" w:cs="Consolas" w:eastAsia="Consolas" w:hAnsi="Consolas"/>
+          <w:sz w:val="17"/>
+          <w:szCs w:val="17"/>
+        </w:rPr>
+        <w:t xml:space="preserve">Updated Test Name</w:t>
+      </w:r>
+      <w:r>
+        <w:rPr>
+          <w:sz w:val="18"/>
+          <w:szCs w:val="18"/>
+        </w:rPr>
+        <w:t xml:space="preserve">. The test restored the name “Administrator” afterward. </w:t>
+      </w:r>
+      <w:r>
+        <w:rPr>
+          <w:b/>
+          <w:bCs/>
+          <w:sz w:val="18"/>
+          <w:szCs w:val="18"/>
+        </w:rPr>
+        <w:t xml:space="preserve">PASS.</w:t>
+      </w:r>
+    </w:p>
+    <w:p>
+      <w:pPr>
         <w:pStyle w:val="Heading3"/>
         <w:keepNext/>
       </w:pPr>
@@ -7947,7 +8610,7 @@
     </w:p>
     <w:p>
       <w:pPr>
-        <w:spacing w:after="240"/>
+        <w:spacing w:after="80"/>
       </w:pPr>
       <w:r>
         <w:drawing>
@@ -7992,6 +8655,57 @@
     </w:p>
     <w:p>
       <w:pPr>
+        <w:spacing w:after="280"/>
+      </w:pPr>
+      <w:r>
+        <w:rPr>
+          <w:sz w:val="18"/>
+          <w:szCs w:val="18"/>
+        </w:rPr>
+        <w:t xml:space="preserve">Actual result (Test 14): The page showed “Current password is incorrect.” The password did not change: Test 15 still logged in with </w:t>
+      </w:r>
+      <w:r>
+        <w:rPr>
+          <w:rFonts w:ascii="Consolas" w:cs="Consolas" w:eastAsia="Consolas" w:hAnsi="Consolas"/>
+          <w:sz w:val="17"/>
+          <w:szCs w:val="17"/>
+        </w:rPr>
+        <w:t xml:space="preserve">admin</w:t>
+      </w:r>
+      <w:r>
+        <w:rPr>
+          <w:sz w:val="18"/>
+          <w:szCs w:val="18"/>
+        </w:rPr>
+        <w:t xml:space="preserve"> / </w:t>
+      </w:r>
+      <w:r>
+        <w:rPr>
+          <w:rFonts w:ascii="Consolas" w:cs="Consolas" w:eastAsia="Consolas" w:hAnsi="Consolas"/>
+          <w:sz w:val="17"/>
+          <w:szCs w:val="17"/>
+        </w:rPr>
+        <w:t xml:space="preserve">password</w:t>
+      </w:r>
+      <w:r>
+        <w:rPr>
+          <w:sz w:val="18"/>
+          <w:szCs w:val="18"/>
+        </w:rPr>
+        <w:t xml:space="preserve">. </w:t>
+      </w:r>
+      <w:r>
+        <w:rPr>
+          <w:b/>
+          <w:bCs/>
+          <w:sz w:val="18"/>
+          <w:szCs w:val="18"/>
+        </w:rPr>
+        <w:t xml:space="preserve">PASS.</w:t>
+      </w:r>
+    </w:p>
+    <w:p>
+      <w:pPr>
         <w:pStyle w:val="Heading3"/>
         <w:keepNext/>
       </w:pPr>
@@ -8001,7 +8715,7 @@
     </w:p>
     <w:p>
       <w:pPr>
-        <w:spacing w:after="240"/>
+        <w:spacing w:after="80"/>
       </w:pPr>
       <w:r>
         <w:drawing>
@@ -8046,6 +8760,27 @@
     </w:p>
     <w:p>
       <w:pPr>
+        <w:spacing w:after="280"/>
+      </w:pPr>
+      <w:r>
+        <w:rPr>
+          <w:sz w:val="18"/>
+          <w:szCs w:val="18"/>
+        </w:rPr>
+        <w:t xml:space="preserve">Actual result (Test 15): The 08/10/2026 report showed Samsung TV 55" (2 sold, 13 left, $999.98) and Wireless Mouse (2 sold, 0 left, $51.98). Totals: 4 units, $1,051.96, 287 in stock, 10 products. The 01/01/2020 report showed “No sales were recorded on 01/01/2020. The table below shows current inventory levels only.” with 0 units and $0.00. </w:t>
+      </w:r>
+      <w:r>
+        <w:rPr>
+          <w:b/>
+          <w:bCs/>
+          <w:sz w:val="18"/>
+          <w:szCs w:val="18"/>
+        </w:rPr>
+        <w:t xml:space="preserve">PASS.</w:t>
+      </w:r>
+    </w:p>
+    <w:p>
+      <w:pPr>
         <w:pStyle w:val="Heading3"/>
         <w:keepNext/>
       </w:pPr>
@@ -8055,7 +8790,7 @@
     </w:p>
     <w:p>
       <w:pPr>
-        <w:spacing w:after="240"/>
+        <w:spacing w:after="80"/>
       </w:pPr>
       <w:r>
         <w:drawing>
@@ -8096,6 +8831,27 @@
             </a:graphic>
           </wp:inline>
         </w:drawing>
+      </w:r>
+    </w:p>
+    <w:p>
+      <w:pPr>
+        <w:spacing w:after="280"/>
+      </w:pPr>
+      <w:r>
+        <w:rPr>
+          <w:sz w:val="18"/>
+          <w:szCs w:val="18"/>
+        </w:rPr>
+        <w:t xml:space="preserve">Actual result (Test 15): The 08/10/2026 report showed Samsung TV 55" (2 sold, 13 left, $999.98) and Wireless Mouse (2 sold, 0 left, $51.98). Totals: 4 units, $1,051.96, 287 in stock, 10 products. The 01/01/2020 report showed “No sales were recorded on 01/01/2020. The table below shows current inventory levels only.” with 0 units and $0.00. </w:t>
+      </w:r>
+      <w:r>
+        <w:rPr>
+          <w:b/>
+          <w:bCs/>
+          <w:sz w:val="18"/>
+          <w:szCs w:val="18"/>
+        </w:rPr>
+        <w:t xml:space="preserve">PASS.</w:t>
       </w:r>
     </w:p>
     <w:sectPr>

</xml_diff>